<commit_message>
docs: corrige historico do AS IS (processo tinha dois estagios, nao um)
O AS IS descrito na documentacao formal (secao 2.3) tratava o fluxo de
scripts + CSV (nexus_remote.sh/servidores.conf/usuarios.csv) como se
fosse o processo original. Na verdade esse fluxo ja era, ele mesmo, um
prototipo/evolucao criado antes deste projeto de IA - o processo
verdadeiramente original era 100% manual via terminal, login/senha por
servidor, comandos padrao do Linux digitados um a um, sem nenhum script
nem auditoria.

Reescreve a secao 2.3 em tres estagios (manual original -> prototipo
script/CSV -> NEXUS), deixando explicito que o AS IS de referencia do
documento e o Estagio 2. Regenera o .docx e registra a clarificacao em
DOCUMENTACAO_TECNICA.md (secao 54) para futuras apresentacoes.

Co-Authored-By: Claude Sonnet 5 <noreply@anthropic.com>
</commit_message>
<xml_diff>
--- a/docs/DOCUMENTACAO_PROJETO_ESTAGIO_IA.docx
+++ b/docs/DOCUMENTACAO_PROJETO_ESTAGIO_IA.docx
@@ -768,7 +768,7 @@
           <w:b/>
           <w:sz w:val="24"/>
         </w:rPr>
-        <w:t>2.3 Descrição do processo atual (AS IS)</w:t>
+        <w:t>2.3 Descrição do processo (evolução até o NEXUS)</w:t>
       </w:r>
     </w:p>
     <w:p>
@@ -783,7 +783,103 @@
           <w:i w:val="0"/>
           <w:sz w:val="24"/>
         </w:rPr>
-        <w:t>Antes do NEXUS, o processo era operado por um script de linha de comando (nexus_sanitize_users.sh) disparado por um controlador remoto (nexus_remote.sh) que lia uma lista de servidores em texto (servidores.conf) e um lote de usuários a processar em um arquivo usuarios.csv. Esse script continua existindo e é reaproveitado pelo NEXUS (ver seção 4.2) — a mudança não foi na lógica de baixo nível, testada e validada, mas em como ela é operada.</w:t>
+        <w:t>A gestão de usuários passou por dois estágios de evolução antes deste projeto de IA começar. É importante registrar essa linha do tempo corretamente, porque o ganho real do NEXUS só fica claro quando comparado ao processo verdadeiramente original — e não a uma versão dele que já havia sido parcialmente automatizada antes deste projeto.</w:t>
+      </w:r>
+    </w:p>
+    <w:p>
+      <w:pPr>
+        <w:keepNext/>
+        <w:spacing w:before="360" w:after="160"/>
+      </w:pPr>
+      <w:r>
+        <w:rPr>
+          <w:rFonts w:ascii="Times New Roman" w:hAnsi="Times New Roman"/>
+          <w:b/>
+          <w:sz w:val="24"/>
+        </w:rPr>
+        <w:t>2.3.1 Estágio 1 — processo manual original (anterior a qualquer automação)</w:t>
+      </w:r>
+    </w:p>
+    <w:p>
+      <w:pPr>
+        <w:spacing w:before="0" w:after="120" w:line="360" w:lineRule="auto"/>
+        <w:jc w:val="both"/>
+      </w:pPr>
+      <w:r>
+        <w:rPr>
+          <w:rFonts w:ascii="Times New Roman" w:hAnsi="Times New Roman"/>
+          <w:b w:val="0"/>
+          <w:i w:val="0"/>
+          <w:sz w:val="24"/>
+        </w:rPr>
+        <w:t>Antes de existir qualquer script, cada ação de gestão de usuário era feita por completo manualmente, servidor por servidor, sem nenhuma ferramenta de apoio:</w:t>
+      </w:r>
+    </w:p>
+    <w:p>
+      <w:pPr>
+        <w:pStyle w:val="ListNumber"/>
+        <w:spacing w:line="360" w:lineRule="auto" w:after="80"/>
+      </w:pPr>
+      <w:r>
+        <w:rPr>
+          <w:rFonts w:ascii="Times New Roman" w:hAnsi="Times New Roman"/>
+          <w:sz w:val="24"/>
+        </w:rPr>
+        <w:t>O analista abre uma sessão SSH diretamente para um servidor específico, autenticando com login e senha (sem chave SSH, sem automação, um servidor de cada vez).</w:t>
+      </w:r>
+    </w:p>
+    <w:p>
+      <w:pPr>
+        <w:pStyle w:val="ListNumber"/>
+        <w:spacing w:line="360" w:lineRule="auto" w:after="80"/>
+      </w:pPr>
+      <w:r>
+        <w:rPr>
+          <w:rFonts w:ascii="Times New Roman" w:hAnsi="Times New Roman"/>
+          <w:sz w:val="24"/>
+        </w:rPr>
+        <w:t>Digita, um a um, os comandos padrão do próprio Linux correspondentes à ação desejada — por exemplo useradd/passwd/chage -d 0 para criar; usermod -L/chage -E 0 para bloquear; userdel ou userdel -r para remover/purgar.</w:t>
+      </w:r>
+    </w:p>
+    <w:p>
+      <w:pPr>
+        <w:pStyle w:val="ListNumber"/>
+        <w:spacing w:line="360" w:lineRule="auto" w:after="80"/>
+      </w:pPr>
+      <w:r>
+        <w:rPr>
+          <w:rFonts w:ascii="Times New Roman" w:hAnsi="Times New Roman"/>
+          <w:sz w:val="24"/>
+        </w:rPr>
+        <w:t>Confere manualmente o resultado ainda na mesma sessão (ex.: id, passwd -S).</w:t>
+      </w:r>
+    </w:p>
+    <w:p>
+      <w:pPr>
+        <w:pStyle w:val="ListNumber"/>
+        <w:spacing w:line="360" w:lineRule="auto" w:after="80"/>
+      </w:pPr>
+      <w:r>
+        <w:rPr>
+          <w:rFonts w:ascii="Times New Roman" w:hAnsi="Times New Roman"/>
+          <w:sz w:val="24"/>
+        </w:rPr>
+        <w:t>Encerra a sessão e repete os passos 1 a 3 inteiramente do zero no próximo servidor, caso a mesma ação precise ser aplicada em mais de um.</w:t>
+      </w:r>
+    </w:p>
+    <w:p>
+      <w:pPr>
+        <w:spacing w:before="0" w:after="120" w:line="360" w:lineRule="auto"/>
+        <w:jc w:val="both"/>
+      </w:pPr>
+      <w:r>
+        <w:rPr>
+          <w:rFonts w:ascii="Times New Roman" w:hAnsi="Times New Roman"/>
+          <w:b w:val="0"/>
+          <w:i w:val="0"/>
+          <w:sz w:val="24"/>
+        </w:rPr>
+        <w:t>Não havia script, não havia lista de servidores centralizada, não havia planilha de lote e não havia nenhum arquivo de log de auditoria — o único registro, quando existia, era feito de memória ou em anotações avulsas do próprio analista. Esse é o processo genuinamente original: mais lento, sem nenhuma padronização entre execuções, e mais sujeito a erro de digitação em comandos potencialmente destrutivos (ex.: um userdel -r digitado no usuário errado, sem nenhuma etapa de simulação prévia).</w:t>
       </w:r>
     </w:p>
     <w:p>
@@ -798,7 +894,75 @@
           <w:i w:val="0"/>
           <w:sz w:val="24"/>
         </w:rPr>
-        <w:t>Fluxo sequencial do processo AS IS:</w:t>
+        <w:t xml:space="preserve">Tempo médio gasto (estimativa qualificada): </w:t>
+      </w:r>
+      <w:r>
+        <w:rPr>
+          <w:rFonts w:ascii="Times New Roman" w:hAnsi="Times New Roman"/>
+          <w:b w:val="0"/>
+          <w:i w:val="0"/>
+          <w:sz w:val="24"/>
+        </w:rPr>
+        <w:t>da ordem de 25 a 35 minutos por ação, por servidor, somando login manual, digitação de múltiplos comandos individuais e conferência manual do resultado — sem nenhum log automático de apoio.</w:t>
+      </w:r>
+    </w:p>
+    <w:p>
+      <w:pPr>
+        <w:keepNext/>
+        <w:spacing w:before="360" w:after="160"/>
+      </w:pPr>
+      <w:r>
+        <w:rPr>
+          <w:rFonts w:ascii="Times New Roman" w:hAnsi="Times New Roman"/>
+          <w:b/>
+          <w:sz w:val="24"/>
+        </w:rPr>
+        <w:t>2.3.2 Estágio 2 — protótipo com script e planilha CSV</w:t>
+      </w:r>
+    </w:p>
+    <w:p>
+      <w:pPr>
+        <w:spacing w:before="0" w:after="120" w:line="360" w:lineRule="auto"/>
+        <w:jc w:val="both"/>
+      </w:pPr>
+      <w:r>
+        <w:rPr>
+          <w:rFonts w:ascii="Times New Roman" w:hAnsi="Times New Roman"/>
+          <w:b w:val="0"/>
+          <w:i w:val="0"/>
+          <w:sz w:val="24"/>
+        </w:rPr>
+        <w:t>Como uma primeira evolução — ainda anterior a este projeto de IA — foi criado, pela própria equipe, um protótipo de automação por linha de comando: um controlador remoto (nexus_remote.sh), uma lista de servidores em texto (servidores.conf), um script único que padroniza as ações no servidor de destino (nexus_sanitize_users.sh) e um arquivo de lote (usuarios.csv) onde o analista descrevia os usuários e ações a processar. Esse script continua existindo e é reaproveitado pelo NEXUS sem alterações na lógica (ver seção 4.2).</w:t>
+      </w:r>
+    </w:p>
+    <w:p>
+      <w:pPr>
+        <w:spacing w:before="0" w:after="120" w:line="360" w:lineRule="auto"/>
+        <w:jc w:val="both"/>
+      </w:pPr>
+      <w:r>
+        <w:rPr>
+          <w:rFonts w:ascii="Times New Roman" w:hAnsi="Times New Roman"/>
+          <w:b w:val="0"/>
+          <w:i w:val="0"/>
+          <w:sz w:val="24"/>
+        </w:rPr>
+        <w:t>Esse protótipo trouxe uma melhoria real sobre o Estágio 1 — o mesmo comando sempre executa a mesma sequência testada de ações no servidor, sem depender da memória do analista para lembrar cada comando individual, e passou a gerar relatórios de execução (TXT/JSON/CSV) em cada servidor. Mas manteve dois atritos importantes, que se tornaram o novo gargalo:</w:t>
+      </w:r>
+    </w:p>
+    <w:p>
+      <w:pPr>
+        <w:spacing w:before="0" w:after="120" w:line="360" w:lineRule="auto"/>
+        <w:jc w:val="both"/>
+      </w:pPr>
+      <w:r>
+        <w:rPr>
+          <w:rFonts w:ascii="Times New Roman" w:hAnsi="Times New Roman"/>
+          <w:b/>
+          <w:i w:val="0"/>
+          <w:sz w:val="24"/>
+        </w:rPr>
+        <w:t>Fluxo sequencial do Estágio 2:</w:t>
       </w:r>
     </w:p>
     <w:p>
@@ -976,7 +1140,7 @@
           <w:i w:val="0"/>
           <w:sz w:val="24"/>
         </w:rPr>
-        <w:t xml:space="preserve">Tempo médio gasto (estimado, a validar com medição real após adoção plena): </w:t>
+        <w:t xml:space="preserve">Tempo médio gasto (estimativa qualificada, a validar com medição real após adoção plena): </w:t>
       </w:r>
       <w:r>
         <w:rPr>
@@ -985,7 +1149,36 @@
           <w:i w:val="0"/>
           <w:sz w:val="24"/>
         </w:rPr>
-        <w:t>aproximadamente 15 a 20 minutos por ação, por servidor, somando edição de CSV, execução, digitação de senha e conferência manual de log — ação replicada em cada servidor de destino, sem paralelismo.</w:t>
+        <w:t>aproximadamente 15 a 20 minutos por ação, por servidor, somando edição de CSV, execução, digitação de senha e conferência manual de log — ação replicada em cada servidor de destino, sem paralelismo. Já representa uma melhoria frente ao Estágio 1, mas ainda está longe do potencial de automação real.</w:t>
+      </w:r>
+    </w:p>
+    <w:p>
+      <w:pPr>
+        <w:keepNext/>
+        <w:spacing w:before="360" w:after="160"/>
+      </w:pPr>
+      <w:r>
+        <w:rPr>
+          <w:rFonts w:ascii="Times New Roman" w:hAnsi="Times New Roman"/>
+          <w:b/>
+          <w:sz w:val="24"/>
+        </w:rPr>
+        <w:t>2.3.3 Ponto de partida deste projeto (AS IS de referência)</w:t>
+      </w:r>
+    </w:p>
+    <w:p>
+      <w:pPr>
+        <w:spacing w:before="0" w:after="120" w:line="360" w:lineRule="auto"/>
+        <w:jc w:val="both"/>
+      </w:pPr>
+      <w:r>
+        <w:rPr>
+          <w:rFonts w:ascii="Times New Roman" w:hAnsi="Times New Roman"/>
+          <w:b w:val="0"/>
+          <w:i w:val="0"/>
+          <w:sz w:val="24"/>
+        </w:rPr>
+        <w:t>Este projeto de IA parte do Estágio 2 como baseline operacional imediato: é esse fluxo de scripts e planilha CSV que o NEXUS Dashboard substitui diretamente, reaproveitando a lógica já testada do script (nexus_sanitize_users.sh) sem reescrevê-la, mas eliminando a necessidade de editar CSV manualmente e de digitar senha a cada execução. A comparação AS IS x TO BE apresentada nas seções 3 e 5 deste documento toma o Estágio 2 como referência de "processo atual", por ser o que estava efetivamente em uso no momento em que este projeto foi iniciado. O Estágio 1 é apresentado aqui como contexto histórico indispensável, para que o ganho do projeto seja dimensionado sobre a evolução completa do processo, não apenas sobre a etapa mais recente dela.</w:t>
       </w:r>
     </w:p>
     <w:p>

</xml_diff>

<commit_message>
docs: adiciona secao de trabalhos futuros - suporte a servidores Windows
Registra, como proposta de roadmap (fora do escopo atual entregue), uma
ideia de arquitetura para estender o NEXUS a servidores Windows com
dashboard grafico equivalente ao de Linux: reaproveitar Flask/SQLite/
Ansible, trocando SSH por WinRM (colecao ansible.windows), com novo
conjunto de playbooks Windows e decisoes em aberto sobre contas locais
x Active Directory, credencial de servico delegada e coleta de
historico de comandos (sem equivalente direto ao bash_history).

Co-Authored-By: Claude Sonnet 5 <noreply@anthropic.com>
</commit_message>
<xml_diff>
--- a/docs/DOCUMENTACAO_PROJETO_ESTAGIO_IA.docx
+++ b/docs/DOCUMENTACAO_PROJETO_ESTAGIO_IA.docx
@@ -544,7 +544,22 @@
           <w:i w:val="0"/>
           <w:sz w:val="24"/>
         </w:rPr>
-        <w:t>9 CONCLUSÃO</w:t>
+        <w:t>9 TRABALHOS FUTUROS: SUPORTE A SERVIDORES WINDOWS</w:t>
+      </w:r>
+    </w:p>
+    <w:p>
+      <w:pPr>
+        <w:spacing w:before="0" w:after="120" w:line="360" w:lineRule="auto"/>
+        <w:jc w:val="left"/>
+      </w:pPr>
+      <w:r>
+        <w:rPr>
+          <w:rFonts w:ascii="Times New Roman" w:hAnsi="Times New Roman"/>
+          <w:b w:val="0"/>
+          <w:i w:val="0"/>
+          <w:sz w:val="24"/>
+        </w:rPr>
+        <w:t>10 CONCLUSÃO</w:t>
       </w:r>
     </w:p>
     <w:p>
@@ -3107,7 +3122,763 @@
           <w:b/>
           <w:sz w:val="24"/>
         </w:rPr>
-        <w:t>9 CONCLUSÃO</w:t>
+        <w:t>9 TRABALHOS FUTUROS: SUPORTE A SERVIDORES WINDOWS</w:t>
+      </w:r>
+    </w:p>
+    <w:p>
+      <w:pPr>
+        <w:spacing w:line="360" w:lineRule="auto" w:after="200"/>
+      </w:pPr>
+      <w:r>
+        <w:rPr>
+          <w:rFonts w:ascii="Times New Roman" w:hAnsi="Times New Roman"/>
+          <w:b/>
+          <w:i/>
+          <w:sz w:val="24"/>
+        </w:rPr>
+        <w:t xml:space="preserve">Natureza deste item. </w:t>
+      </w:r>
+      <w:r>
+        <w:rPr>
+          <w:rFonts w:ascii="Times New Roman" w:hAnsi="Times New Roman"/>
+          <w:i/>
+          <w:sz w:val="24"/>
+        </w:rPr>
+        <w:t>O conteúdo desta seção é uma proposta de evolução — uma ideia de arquitetura a ser avaliada e amadurecida — e não faz parte do escopo entregue neste projeto. Está registrado aqui para orientar decisões técnicas quando essa expansão for priorizada em uma fase futura.</w:t>
+      </w:r>
+    </w:p>
+    <w:p>
+      <w:pPr>
+        <w:keepNext/>
+        <w:spacing w:before="360" w:after="160"/>
+      </w:pPr>
+      <w:r>
+        <w:rPr>
+          <w:rFonts w:ascii="Times New Roman" w:hAnsi="Times New Roman"/>
+          <w:b/>
+          <w:sz w:val="24"/>
+        </w:rPr>
+        <w:t>9.1 Motivação</w:t>
+      </w:r>
+    </w:p>
+    <w:p>
+      <w:pPr>
+        <w:spacing w:before="0" w:after="120" w:line="360" w:lineRule="auto"/>
+        <w:jc w:val="both"/>
+      </w:pPr>
+      <w:r>
+        <w:rPr>
+          <w:rFonts w:ascii="Times New Roman" w:hAnsi="Times New Roman"/>
+          <w:b w:val="0"/>
+          <w:i w:val="0"/>
+          <w:sz w:val="24"/>
+        </w:rPr>
+        <w:t>O ambiente de infraestrutura da empresa não é composto só por servidores Linux — há (ou pode haver, dependendo da área) servidores Windows com o mesmo tipo de necessidade: contas de usuário criadas no onboarding, bloqueadas/removidas no offboarding, e o mesmo risco de contas esquecidas sem revisão. Hoje esse universo Windows não é coberto pelo NEXUS. A ideia é estender o mesmo conceito — painel único, execução orquestrada, auditoria centralizada e um resumo gerado por IA local — para contas Windows, evitando manter duas ferramentas completamente separadas para o mesmo tipo de processo.</w:t>
+      </w:r>
+    </w:p>
+    <w:p>
+      <w:pPr>
+        <w:keepNext/>
+        <w:spacing w:before="360" w:after="160"/>
+      </w:pPr>
+      <w:r>
+        <w:rPr>
+          <w:rFonts w:ascii="Times New Roman" w:hAnsi="Times New Roman"/>
+          <w:b/>
+          <w:sz w:val="24"/>
+        </w:rPr>
+        <w:t>9.2 Desafios técnicos específicos do Windows</w:t>
+      </w:r>
+    </w:p>
+    <w:p>
+      <w:pPr>
+        <w:spacing w:before="0" w:after="120" w:line="360" w:lineRule="auto"/>
+        <w:jc w:val="both"/>
+      </w:pPr>
+      <w:r>
+        <w:rPr>
+          <w:rFonts w:ascii="Times New Roman" w:hAnsi="Times New Roman"/>
+          <w:b w:val="0"/>
+          <w:i w:val="0"/>
+          <w:sz w:val="24"/>
+        </w:rPr>
+        <w:t>A automação em Windows não é uma simples adaptação do que já existe — o mecanismo de execução remota é outro:</w:t>
+      </w:r>
+    </w:p>
+    <w:p>
+      <w:pPr>
+        <w:pStyle w:val="ListBullet"/>
+        <w:spacing w:line="360" w:lineRule="auto" w:after="80"/>
+      </w:pPr>
+      <w:r>
+        <w:rPr>
+          <w:rFonts w:ascii="Times New Roman" w:hAnsi="Times New Roman"/>
+          <w:b/>
+          <w:sz w:val="24"/>
+        </w:rPr>
+        <w:t xml:space="preserve">Protocolo de acesso remoto diferente. </w:t>
+      </w:r>
+      <w:r>
+        <w:rPr>
+          <w:rFonts w:ascii="Times New Roman" w:hAnsi="Times New Roman"/>
+          <w:sz w:val="24"/>
+        </w:rPr>
+        <w:t>Linux usa SSH; Windows usa nativamente WinRM (Windows Remote Management, baseado em WS-Management). É preciso que cada servidor Windows tenha um listener WinRM habilitado (HTTP ou, preferencialmente, HTTPS) — um passo de preparação equivalente ao ssh-copy-id de hoje, mas com mecanismo próprio.</w:t>
+      </w:r>
+    </w:p>
+    <w:p>
+      <w:pPr>
+        <w:pStyle w:val="ListBullet"/>
+        <w:spacing w:line="360" w:lineRule="auto" w:after="80"/>
+      </w:pPr>
+      <w:r>
+        <w:rPr>
+          <w:rFonts w:ascii="Times New Roman" w:hAnsi="Times New Roman"/>
+          <w:b/>
+          <w:sz w:val="24"/>
+        </w:rPr>
+        <w:t xml:space="preserve">Comandos de gestão de usuário diferentes. </w:t>
+      </w:r>
+      <w:r>
+        <w:rPr>
+          <w:rFonts w:ascii="Times New Roman" w:hAnsi="Times New Roman"/>
+          <w:sz w:val="24"/>
+        </w:rPr>
+        <w:t>Não existem useradd/usermod/userdel no Windows. O equivalente é feito via PowerShell (New-LocalUser, Set-LocalUser, Disable-LocalUser, Remove-LocalUser) ou, em ambiente de domínio, via módulo ActiveDirectory (New-ADUser, Disable-ADAccount, Remove-ADUser). O script nexus_sanitize_users.sh (Bash) não é reaproveitável nesse cenário — precisaria de um equivalente escrito para Windows.</w:t>
+      </w:r>
+    </w:p>
+    <w:p>
+      <w:pPr>
+        <w:pStyle w:val="ListBullet"/>
+        <w:spacing w:line="360" w:lineRule="auto" w:after="80"/>
+      </w:pPr>
+      <w:r>
+        <w:rPr>
+          <w:rFonts w:ascii="Times New Roman" w:hAnsi="Times New Roman"/>
+          <w:b/>
+          <w:sz w:val="24"/>
+        </w:rPr>
+        <w:t xml:space="preserve">Sem "sudo". </w:t>
+      </w:r>
+      <w:r>
+        <w:rPr>
+          <w:rFonts w:ascii="Times New Roman" w:hAnsi="Times New Roman"/>
+          <w:sz w:val="24"/>
+        </w:rPr>
+        <w:t>O Windows não tem um conceito equivalente de elevação de privilégio por senha avulsa a cada execução — a própria credencial usada na conexão WinRM já precisa ter, de origem, permissão administrativa (local ou delegada via domínio). Muda o modelo de segredo guardado no Vault: em vez de "senha de sudo do servidor X", seria "credencial de uma conta de serviço com permissão delegada", com implicações de segurança próprias (privilégio permanente da credencial, não pontual).</w:t>
+      </w:r>
+    </w:p>
+    <w:p>
+      <w:pPr>
+        <w:pStyle w:val="ListBullet"/>
+        <w:spacing w:line="360" w:lineRule="auto" w:after="80"/>
+      </w:pPr>
+      <w:r>
+        <w:rPr>
+          <w:rFonts w:ascii="Times New Roman" w:hAnsi="Times New Roman"/>
+          <w:b/>
+          <w:sz w:val="24"/>
+        </w:rPr>
+        <w:t xml:space="preserve">Escopo de identidade a decidir. </w:t>
+      </w:r>
+      <w:r>
+        <w:rPr>
+          <w:rFonts w:ascii="Times New Roman" w:hAnsi="Times New Roman"/>
+          <w:sz w:val="24"/>
+        </w:rPr>
+        <w:t>Servidores Windows corporativos, na prática, costumam gerenciar contas via Active Directory (domínio), não contas locais por servidor — diferente do modelo atual do NEXUS (local por servidor). Essa é uma decisão de arquitetura relevante a se tomar antes de iniciar: gerenciar contas locais isoladas por servidor Windows, ou integrar com o Active Directory da empresa (mais próximo da realidade corporativa, porém com superfície de impacto maior).</w:t>
+      </w:r>
+    </w:p>
+    <w:p>
+      <w:pPr>
+        <w:pStyle w:val="ListBullet"/>
+        <w:spacing w:line="360" w:lineRule="auto" w:after="80"/>
+      </w:pPr>
+      <w:r>
+        <w:rPr>
+          <w:rFonts w:ascii="Times New Roman" w:hAnsi="Times New Roman"/>
+          <w:b/>
+          <w:sz w:val="24"/>
+        </w:rPr>
+        <w:t xml:space="preserve">Sem equivalente direto ao bash_history. </w:t>
+      </w:r>
+      <w:r>
+        <w:rPr>
+          <w:rFonts w:ascii="Times New Roman" w:hAnsi="Times New Roman"/>
+          <w:sz w:val="24"/>
+        </w:rPr>
+        <w:t>A coleta de histórico de comandos (hoje best-effort, via ~/.bash_history) não tem paralelo direto no Windows — exigiria habilitar auditoria de linha de comando (Log de Eventos do Windows, Event ID 4688, com Process Creation Command Line Auditing ativado via GPO) nos servidores geridos antes de qualquer coleta funcionar, o que é uma configuração prévia a ser feita no ambiente, não algo que o NEXUS resolve sozinho.</w:t>
+      </w:r>
+    </w:p>
+    <w:p>
+      <w:pPr>
+        <w:keepNext/>
+        <w:spacing w:before="360" w:after="160"/>
+      </w:pPr>
+      <w:r>
+        <w:rPr>
+          <w:rFonts w:ascii="Times New Roman" w:hAnsi="Times New Roman"/>
+          <w:b/>
+          <w:sz w:val="24"/>
+        </w:rPr>
+        <w:t>9.3 Proposta de arquitetura (ideia)</w:t>
+      </w:r>
+    </w:p>
+    <w:p>
+      <w:pPr>
+        <w:spacing w:before="0" w:after="120" w:line="360" w:lineRule="auto"/>
+        <w:jc w:val="both"/>
+      </w:pPr>
+      <w:r>
+        <w:rPr>
+          <w:rFonts w:ascii="Times New Roman" w:hAnsi="Times New Roman"/>
+          <w:b w:val="0"/>
+          <w:i w:val="0"/>
+          <w:sz w:val="24"/>
+        </w:rPr>
+        <w:t>A proposta é não recriar o NEXUS do zero para Windows, e sim estender a base já existente:</w:t>
+      </w:r>
+    </w:p>
+    <w:p>
+      <w:pPr>
+        <w:pStyle w:val="ListBullet"/>
+        <w:spacing w:line="360" w:lineRule="auto" w:after="80"/>
+      </w:pPr>
+      <w:r>
+        <w:rPr>
+          <w:rFonts w:ascii="Times New Roman" w:hAnsi="Times New Roman"/>
+          <w:b/>
+          <w:sz w:val="24"/>
+        </w:rPr>
+        <w:t xml:space="preserve">Manter o mesmo painel Flask e o mesmo banco SQLite, </w:t>
+      </w:r>
+      <w:r>
+        <w:rPr>
+          <w:rFonts w:ascii="Times New Roman" w:hAnsi="Times New Roman"/>
+          <w:sz w:val="24"/>
+        </w:rPr>
+        <w:t>adicionando uma coluna platform (linux/windows) à tabela servers, para o dashboard saber qual conjunto de playbooks/execuções usar por servidor.</w:t>
+      </w:r>
+    </w:p>
+    <w:p>
+      <w:pPr>
+        <w:pStyle w:val="ListBullet"/>
+        <w:spacing w:line="360" w:lineRule="auto" w:after="80"/>
+      </w:pPr>
+      <w:r>
+        <w:rPr>
+          <w:rFonts w:ascii="Times New Roman" w:hAnsi="Times New Roman"/>
+          <w:b/>
+          <w:sz w:val="24"/>
+        </w:rPr>
+        <w:t xml:space="preserve">Manter o Ansible como motor de orquestração. </w:t>
+      </w:r>
+      <w:r>
+        <w:rPr>
+          <w:rFonts w:ascii="Times New Roman" w:hAnsi="Times New Roman"/>
+          <w:sz w:val="24"/>
+        </w:rPr>
+        <w:t>O Ansible já possui uma coleção oficial para Windows (ansible.windows), com módulos como win_user, win_group e win_user_right, conectando via ansible_connection: winrm em vez de SSH. Isso significaria reaproveitar praticamente toda a integração já construída (ansible_bridge.py, captura de artefatos, leitura de status de execução ok/skipped/blocked/failed) — trocando apenas o conjunto de playbooks e o plugin de conexão, sem reescrever a camada de orquestração.</w:t>
+      </w:r>
+    </w:p>
+    <w:p>
+      <w:pPr>
+        <w:pStyle w:val="ListBullet"/>
+        <w:spacing w:line="360" w:lineRule="auto" w:after="80"/>
+      </w:pPr>
+      <w:r>
+        <w:rPr>
+          <w:rFonts w:ascii="Times New Roman" w:hAnsi="Times New Roman"/>
+          <w:b/>
+          <w:sz w:val="24"/>
+        </w:rPr>
+        <w:t xml:space="preserve">Criar um novo conjunto de playbooks Windows, </w:t>
+      </w:r>
+      <w:r>
+        <w:rPr>
+          <w:rFonts w:ascii="Times New Roman" w:hAnsi="Times New Roman"/>
+          <w:sz w:val="24"/>
+        </w:rPr>
+        <w:t>equivalentes em intenção ao nexus_sanitize_users.sh, usando os módulos nativos do Ansible para Windows (não PowerShell solto embutido em script) para as mesmas quatro ações (criar, bloquear, remover, purgar), preservando o mesmo padrão de status já usado na aplicação.</w:t>
+      </w:r>
+    </w:p>
+    <w:p>
+      <w:pPr>
+        <w:pStyle w:val="ListBullet"/>
+        <w:spacing w:line="360" w:lineRule="auto" w:after="80"/>
+      </w:pPr>
+      <w:r>
+        <w:rPr>
+          <w:rFonts w:ascii="Times New Roman" w:hAnsi="Times New Roman"/>
+          <w:b/>
+          <w:sz w:val="24"/>
+        </w:rPr>
+        <w:t xml:space="preserve">Vault: </w:t>
+      </w:r>
+      <w:r>
+        <w:rPr>
+          <w:rFonts w:ascii="Times New Roman" w:hAnsi="Times New Roman"/>
+          <w:sz w:val="24"/>
+        </w:rPr>
+        <w:t>continuar usando Ansible Vault, mas armazenando a credencial da conta de serviço com permissão delegada (WinRM), no mesmo padrão de segredo por servidor (ou por domínio, se a integração com Active Directory for adotada) já usado hoje.</w:t>
+      </w:r>
+    </w:p>
+    <w:p>
+      <w:pPr>
+        <w:pStyle w:val="ListBullet"/>
+        <w:spacing w:line="360" w:lineRule="auto" w:after="80"/>
+      </w:pPr>
+      <w:r>
+        <w:rPr>
+          <w:rFonts w:ascii="Times New Roman" w:hAnsi="Times New Roman"/>
+          <w:b/>
+          <w:sz w:val="24"/>
+        </w:rPr>
+        <w:t xml:space="preserve">Camada de IA (ai_engine.py): </w:t>
+      </w:r>
+      <w:r>
+        <w:rPr>
+          <w:rFonts w:ascii="Times New Roman" w:hAnsi="Times New Roman"/>
+          <w:sz w:val="24"/>
+        </w:rPr>
+        <w:t>não exigiria reescrita conceitual — ela já opera sobre fatos abstratos (status, dias bloqueado, grupos), independentes de sistema operacional. Precisaria apenas de um coletor de fatos equivalente para Windows (ex.: Get-LocalUser/consulta ao Active Directory no lugar do discover_existing_users.yml atual).</w:t>
+      </w:r>
+    </w:p>
+    <w:p>
+      <w:pPr>
+        <w:keepNext/>
+        <w:spacing w:before="360" w:after="160"/>
+      </w:pPr>
+      <w:r>
+        <w:rPr>
+          <w:rFonts w:ascii="Times New Roman" w:hAnsi="Times New Roman"/>
+          <w:b/>
+          <w:sz w:val="24"/>
+        </w:rPr>
+        <w:t>9.4 Tecnologias candidatas (a avaliar)</w:t>
+      </w:r>
+    </w:p>
+    <w:tbl>
+      <w:tblPr>
+        <w:tblStyle w:val="TableGrid"/>
+        <w:tblW w:type="auto" w:w="0"/>
+        <w:jc w:val="center"/>
+        <w:tblLook w:firstColumn="1" w:firstRow="1" w:lastColumn="0" w:lastRow="0" w:noHBand="0" w:noVBand="1" w:val="04A0"/>
+      </w:tblPr>
+      <w:tblGrid>
+        <w:gridCol w:w="3135"/>
+        <w:gridCol w:w="3135"/>
+        <w:gridCol w:w="3135"/>
+      </w:tblGrid>
+      <w:tr>
+        <w:tc>
+          <w:tcPr>
+            <w:tcW w:type="dxa" w:w="3135"/>
+          </w:tcPr>
+          <w:p>
+            <w:pPr>
+              <w:spacing w:after="40" w:line="240" w:lineRule="auto"/>
+            </w:pPr>
+            <w:r/>
+            <w:r>
+              <w:rPr>
+                <w:rFonts w:ascii="Times New Roman" w:hAnsi="Times New Roman"/>
+                <w:b/>
+                <w:sz w:val="20"/>
+              </w:rPr>
+              <w:t>Opção</w:t>
+            </w:r>
+          </w:p>
+        </w:tc>
+        <w:tc>
+          <w:tcPr>
+            <w:tcW w:type="dxa" w:w="3135"/>
+          </w:tcPr>
+          <w:p>
+            <w:pPr>
+              <w:spacing w:after="40" w:line="240" w:lineRule="auto"/>
+            </w:pPr>
+            <w:r/>
+            <w:r>
+              <w:rPr>
+                <w:rFonts w:ascii="Times New Roman" w:hAnsi="Times New Roman"/>
+                <w:b/>
+                <w:sz w:val="20"/>
+              </w:rPr>
+              <w:t>Descrição</w:t>
+            </w:r>
+          </w:p>
+        </w:tc>
+        <w:tc>
+          <w:tcPr>
+            <w:tcW w:type="dxa" w:w="3135"/>
+          </w:tcPr>
+          <w:p>
+            <w:pPr>
+              <w:spacing w:after="40" w:line="240" w:lineRule="auto"/>
+            </w:pPr>
+            <w:r/>
+            <w:r>
+              <w:rPr>
+                <w:rFonts w:ascii="Times New Roman" w:hAnsi="Times New Roman"/>
+                <w:b/>
+                <w:sz w:val="20"/>
+              </w:rPr>
+              <w:t>Observação</w:t>
+            </w:r>
+          </w:p>
+        </w:tc>
+      </w:tr>
+      <w:tr>
+        <w:tc>
+          <w:tcPr>
+            <w:tcW w:type="dxa" w:w="3135"/>
+          </w:tcPr>
+          <w:p>
+            <w:pPr>
+              <w:spacing w:after="40" w:line="240" w:lineRule="auto"/>
+            </w:pPr>
+            <w:r/>
+            <w:r>
+              <w:rPr>
+                <w:rFonts w:ascii="Times New Roman" w:hAnsi="Times New Roman"/>
+                <w:b w:val="0"/>
+                <w:sz w:val="20"/>
+              </w:rPr>
+              <w:t>Ansible + coleção ansible.windows + WinRM (recomendada como ponto de partida)</w:t>
+            </w:r>
+          </w:p>
+        </w:tc>
+        <w:tc>
+          <w:tcPr>
+            <w:tcW w:type="dxa" w:w="3135"/>
+          </w:tcPr>
+          <w:p>
+            <w:pPr>
+              <w:spacing w:after="40" w:line="240" w:lineRule="auto"/>
+            </w:pPr>
+            <w:r/>
+            <w:r>
+              <w:rPr>
+                <w:rFonts w:ascii="Times New Roman" w:hAnsi="Times New Roman"/>
+                <w:b w:val="0"/>
+                <w:sz w:val="20"/>
+              </w:rPr>
+              <w:t>Reaproveita toda a integração Ansible já construída no NEXUS</w:t>
+            </w:r>
+          </w:p>
+        </w:tc>
+        <w:tc>
+          <w:tcPr>
+            <w:tcW w:type="dxa" w:w="3135"/>
+          </w:tcPr>
+          <w:p>
+            <w:pPr>
+              <w:spacing w:after="40" w:line="240" w:lineRule="auto"/>
+            </w:pPr>
+            <w:r/>
+            <w:r>
+              <w:rPr>
+                <w:rFonts w:ascii="Times New Roman" w:hAnsi="Times New Roman"/>
+                <w:b w:val="0"/>
+                <w:sz w:val="20"/>
+              </w:rPr>
+              <w:t>Menor esforço de reescrita; mesma arquitetura de orquestração</w:t>
+            </w:r>
+          </w:p>
+        </w:tc>
+      </w:tr>
+      <w:tr>
+        <w:tc>
+          <w:tcPr>
+            <w:tcW w:type="dxa" w:w="3135"/>
+          </w:tcPr>
+          <w:p>
+            <w:pPr>
+              <w:spacing w:after="40" w:line="240" w:lineRule="auto"/>
+            </w:pPr>
+            <w:r/>
+            <w:r>
+              <w:rPr>
+                <w:rFonts w:ascii="Times New Roman" w:hAnsi="Times New Roman"/>
+                <w:b w:val="0"/>
+                <w:sz w:val="20"/>
+              </w:rPr>
+              <w:t>PowerShell Remoting direto (Invoke-Command, via pypsrp/pywinrm a partir do Python)</w:t>
+            </w:r>
+          </w:p>
+        </w:tc>
+        <w:tc>
+          <w:tcPr>
+            <w:tcW w:type="dxa" w:w="3135"/>
+          </w:tcPr>
+          <w:p>
+            <w:pPr>
+              <w:spacing w:after="40" w:line="240" w:lineRule="auto"/>
+            </w:pPr>
+            <w:r/>
+            <w:r>
+              <w:rPr>
+                <w:rFonts w:ascii="Times New Roman" w:hAnsi="Times New Roman"/>
+                <w:b w:val="0"/>
+                <w:sz w:val="20"/>
+              </w:rPr>
+              <w:t>Chamada remota sem depender do Ansible</w:t>
+            </w:r>
+          </w:p>
+        </w:tc>
+        <w:tc>
+          <w:tcPr>
+            <w:tcW w:type="dxa" w:w="3135"/>
+          </w:tcPr>
+          <w:p>
+            <w:pPr>
+              <w:spacing w:after="40" w:line="240" w:lineRule="auto"/>
+            </w:pPr>
+            <w:r/>
+            <w:r>
+              <w:rPr>
+                <w:rFonts w:ascii="Times New Roman" w:hAnsi="Times New Roman"/>
+                <w:b w:val="0"/>
+                <w:sz w:val="20"/>
+              </w:rPr>
+              <w:t>Mais controle fino, porém duplicaria lógica de orquestração que o Ansible já resolve hoje</w:t>
+            </w:r>
+          </w:p>
+        </w:tc>
+      </w:tr>
+      <w:tr>
+        <w:tc>
+          <w:tcPr>
+            <w:tcW w:type="dxa" w:w="3135"/>
+          </w:tcPr>
+          <w:p>
+            <w:pPr>
+              <w:spacing w:after="40" w:line="240" w:lineRule="auto"/>
+            </w:pPr>
+            <w:r/>
+            <w:r>
+              <w:rPr>
+                <w:rFonts w:ascii="Times New Roman" w:hAnsi="Times New Roman"/>
+                <w:b w:val="0"/>
+                <w:sz w:val="20"/>
+              </w:rPr>
+              <w:t>Microsoft.AD.ADUser / módulo ActiveDirectory (para ambientes de domínio)</w:t>
+            </w:r>
+          </w:p>
+        </w:tc>
+        <w:tc>
+          <w:tcPr>
+            <w:tcW w:type="dxa" w:w="3135"/>
+          </w:tcPr>
+          <w:p>
+            <w:pPr>
+              <w:spacing w:after="40" w:line="240" w:lineRule="auto"/>
+            </w:pPr>
+            <w:r/>
+            <w:r>
+              <w:rPr>
+                <w:rFonts w:ascii="Times New Roman" w:hAnsi="Times New Roman"/>
+                <w:b w:val="0"/>
+                <w:sz w:val="20"/>
+              </w:rPr>
+              <w:t>Gestão de contas centralizada no Active Directory, em vez de contas locais por servidor</w:t>
+            </w:r>
+          </w:p>
+        </w:tc>
+        <w:tc>
+          <w:tcPr>
+            <w:tcW w:type="dxa" w:w="3135"/>
+          </w:tcPr>
+          <w:p>
+            <w:pPr>
+              <w:spacing w:after="40" w:line="240" w:lineRule="auto"/>
+            </w:pPr>
+            <w:r/>
+            <w:r>
+              <w:rPr>
+                <w:rFonts w:ascii="Times New Roman" w:hAnsi="Times New Roman"/>
+                <w:b w:val="0"/>
+                <w:sz w:val="20"/>
+              </w:rPr>
+              <w:t>Mais alinhado à realidade corporativa, mas exige decisão prévia de escopo (seção 9.2)</w:t>
+            </w:r>
+          </w:p>
+        </w:tc>
+      </w:tr>
+      <w:tr>
+        <w:tc>
+          <w:tcPr>
+            <w:tcW w:type="dxa" w:w="3135"/>
+          </w:tcPr>
+          <w:p>
+            <w:pPr>
+              <w:spacing w:after="40" w:line="240" w:lineRule="auto"/>
+            </w:pPr>
+            <w:r/>
+            <w:r>
+              <w:rPr>
+                <w:rFonts w:ascii="Times New Roman" w:hAnsi="Times New Roman"/>
+                <w:b w:val="0"/>
+                <w:sz w:val="20"/>
+              </w:rPr>
+              <w:t>Listener WinRM sobre HTTPS (certificado)</w:t>
+            </w:r>
+          </w:p>
+        </w:tc>
+        <w:tc>
+          <w:tcPr>
+            <w:tcW w:type="dxa" w:w="3135"/>
+          </w:tcPr>
+          <w:p>
+            <w:pPr>
+              <w:spacing w:after="40" w:line="240" w:lineRule="auto"/>
+            </w:pPr>
+            <w:r/>
+            <w:r>
+              <w:rPr>
+                <w:rFonts w:ascii="Times New Roman" w:hAnsi="Times New Roman"/>
+                <w:b w:val="0"/>
+                <w:sz w:val="20"/>
+              </w:rPr>
+              <w:t>Alternativa mais segura ao HTTP + NTLM</w:t>
+            </w:r>
+          </w:p>
+        </w:tc>
+        <w:tc>
+          <w:tcPr>
+            <w:tcW w:type="dxa" w:w="3135"/>
+          </w:tcPr>
+          <w:p>
+            <w:pPr>
+              <w:spacing w:after="40" w:line="240" w:lineRule="auto"/>
+            </w:pPr>
+            <w:r/>
+            <w:r>
+              <w:rPr>
+                <w:rFonts w:ascii="Times New Roman" w:hAnsi="Times New Roman"/>
+                <w:b w:val="0"/>
+                <w:sz w:val="20"/>
+              </w:rPr>
+              <w:t>Recomendado por padrão de segurança, evita tráfego de credencial menos protegido na rede interna</w:t>
+            </w:r>
+          </w:p>
+        </w:tc>
+      </w:tr>
+    </w:tbl>
+    <w:p>
+      <w:pPr>
+        <w:spacing w:after="80"/>
+      </w:pPr>
+    </w:p>
+    <w:p>
+      <w:pPr>
+        <w:keepNext/>
+        <w:spacing w:before="360" w:after="160"/>
+      </w:pPr>
+      <w:r>
+        <w:rPr>
+          <w:rFonts w:ascii="Times New Roman" w:hAnsi="Times New Roman"/>
+          <w:b/>
+          <w:sz w:val="24"/>
+        </w:rPr>
+        <w:t>9.5 Pontos em aberto (decisões necessárias antes de iniciar)</w:t>
+      </w:r>
+    </w:p>
+    <w:p>
+      <w:pPr>
+        <w:pStyle w:val="ListBullet"/>
+        <w:spacing w:line="360" w:lineRule="auto" w:after="80"/>
+      </w:pPr>
+      <w:r>
+        <w:rPr>
+          <w:rFonts w:ascii="Times New Roman" w:hAnsi="Times New Roman"/>
+          <w:sz w:val="24"/>
+        </w:rPr>
+        <w:t>Escopo: contas locais por servidor Windows autônomo, ou contas de domínio via Active Directory?</w:t>
+      </w:r>
+    </w:p>
+    <w:p>
+      <w:pPr>
+        <w:pStyle w:val="ListBullet"/>
+        <w:spacing w:line="360" w:lineRule="auto" w:after="80"/>
+      </w:pPr>
+      <w:r>
+        <w:rPr>
+          <w:rFonts w:ascii="Times New Roman" w:hAnsi="Times New Roman"/>
+          <w:sz w:val="24"/>
+        </w:rPr>
+        <w:t>Qual conta de serviço terá a permissão delegada necessária, e como essa credencial será protegida e com que nível de privilégio mínimo (princípio do menor privilégio)?</w:t>
+      </w:r>
+    </w:p>
+    <w:p>
+      <w:pPr>
+        <w:pStyle w:val="ListBullet"/>
+        <w:spacing w:line="360" w:lineRule="auto" w:after="80"/>
+      </w:pPr>
+      <w:r>
+        <w:rPr>
+          <w:rFonts w:ascii="Times New Roman" w:hAnsi="Times New Roman"/>
+          <w:sz w:val="24"/>
+        </w:rPr>
+        <w:t>Como endereçar a lacuna do histórico de comandos (item mais dependente de configuração prévia do ambiente, fora do controle direto do NEXUS)?</w:t>
+      </w:r>
+    </w:p>
+    <w:p>
+      <w:pPr>
+        <w:pStyle w:val="ListBullet"/>
+        <w:spacing w:line="360" w:lineRule="auto" w:after="80"/>
+      </w:pPr>
+      <w:r>
+        <w:rPr>
+          <w:rFonts w:ascii="Times New Roman" w:hAnsi="Times New Roman"/>
+          <w:sz w:val="24"/>
+        </w:rPr>
+        <w:t>Vale unificar tudo em um único painel multiplataforma (Linux + Windows), ou manter dashboards separados por tecnologia, com auditoria consolidada por trás?</w:t>
+      </w:r>
+    </w:p>
+    <w:p>
+      <w:pPr>
+        <w:keepNext/>
+        <w:spacing w:before="360" w:after="160"/>
+      </w:pPr>
+      <w:r>
+        <w:rPr>
+          <w:rFonts w:ascii="Times New Roman" w:hAnsi="Times New Roman"/>
+          <w:b/>
+          <w:sz w:val="24"/>
+        </w:rPr>
+        <w:t>9.6 Status</w:t>
+      </w:r>
+    </w:p>
+    <w:p>
+      <w:pPr>
+        <w:spacing w:before="0" w:after="120" w:line="360" w:lineRule="auto"/>
+        <w:jc w:val="both"/>
+      </w:pPr>
+      <w:r>
+        <w:rPr>
+          <w:rFonts w:ascii="Times New Roman" w:hAnsi="Times New Roman"/>
+          <w:b w:val="0"/>
+          <w:i w:val="0"/>
+          <w:sz w:val="24"/>
+        </w:rPr>
+        <w:t>Item de evolução do roadmap, ainda não iniciado e fora do escopo atual entregue. Registrado nesta documentação para servir de ponto de partida técnico quando a expansão para servidores Windows for priorizada pela área.</w:t>
+      </w:r>
+    </w:p>
+    <w:p>
+      <w:pPr>
+        <w:keepNext/>
+        <w:spacing w:before="480" w:after="240"/>
+        <w:jc w:val="left"/>
+      </w:pPr>
+      <w:r>
+        <w:rPr>
+          <w:rFonts w:ascii="Times New Roman" w:hAnsi="Times New Roman"/>
+          <w:b/>
+          <w:sz w:val="24"/>
+        </w:rPr>
+        <w:t>10 CONCLUSÃO</w:t>
       </w:r>
     </w:p>
     <w:p>

</xml_diff>